<commit_message>
Completed DashBoard and Weekly Planner Page
</commit_message>
<xml_diff>
--- a/User Manual to run this project.docx
+++ b/User Manual to run this project.docx
@@ -146,15 +146,7 @@
           <w:sz w:val="24"/>
           <w:szCs w:val="24"/>
         </w:rPr>
-        <w:t xml:space="preserve">   # or wherever your folder is</w:t>
-      </w:r>
-      <w:r>
-        <w:rPr>
-          <w:rFonts w:ascii="Times New Roman" w:hAnsi="Times New Roman" w:cs="Times New Roman"/>
-          <w:sz w:val="24"/>
-          <w:szCs w:val="24"/>
-        </w:rPr>
-        <w:t xml:space="preserve"> </w:t>
+        <w:t xml:space="preserve">   # or wherever your folder is </w:t>
       </w:r>
     </w:p>
     <w:p>
@@ -646,10 +638,22 @@
       <w:r>
         <w:rPr>
           <w:rFonts w:ascii="Times New Roman" w:hAnsi="Times New Roman" w:cs="Times New Roman"/>
-          <w:sz w:val="24"/>
-          <w:szCs w:val="24"/>
-        </w:rPr>
-        <w:t>Then in terminal paste one by one the following commands.</w:t>
+        </w:rPr>
+        <w:t xml:space="preserve">Go inside the folder cd  </w:t>
+      </w:r>
+      <w:proofErr w:type="spellStart"/>
+      <w:r>
+        <w:rPr>
+          <w:rFonts w:ascii="Times New Roman" w:hAnsi="Times New Roman" w:cs="Times New Roman"/>
+        </w:rPr>
+        <w:t>ingrido</w:t>
+      </w:r>
+      <w:proofErr w:type="spellEnd"/>
+      <w:r>
+        <w:rPr>
+          <w:rFonts w:ascii="Times New Roman" w:hAnsi="Times New Roman" w:cs="Times New Roman"/>
+        </w:rPr>
+        <w:t>-frontend</w:t>
       </w:r>
     </w:p>
     <w:p>
@@ -657,7 +661,7 @@
         <w:pStyle w:val="ListParagraph"/>
         <w:numPr>
           <w:ilvl w:val="0"/>
-          <w:numId w:val="2"/>
+          <w:numId w:val="1"/>
         </w:numPr>
         <w:rPr>
           <w:rFonts w:ascii="Times New Roman" w:hAnsi="Times New Roman" w:cs="Times New Roman"/>
@@ -665,59 +669,13 @@
           <w:szCs w:val="24"/>
         </w:rPr>
       </w:pPr>
-      <w:proofErr w:type="spellStart"/>
-      <w:r>
-        <w:rPr>
-          <w:rFonts w:ascii="Times New Roman" w:hAnsi="Times New Roman" w:cs="Times New Roman"/>
-          <w:sz w:val="24"/>
-          <w:szCs w:val="24"/>
-        </w:rPr>
-        <w:t>npm</w:t>
-      </w:r>
-      <w:proofErr w:type="spellEnd"/>
-      <w:r>
-        <w:rPr>
-          <w:rFonts w:ascii="Times New Roman" w:hAnsi="Times New Roman" w:cs="Times New Roman"/>
-          <w:sz w:val="24"/>
-          <w:szCs w:val="24"/>
-        </w:rPr>
-        <w:t xml:space="preserve"> create </w:t>
-      </w:r>
-      <w:proofErr w:type="spellStart"/>
-      <w:r>
-        <w:rPr>
-          <w:rFonts w:ascii="Times New Roman" w:hAnsi="Times New Roman" w:cs="Times New Roman"/>
-          <w:sz w:val="24"/>
-          <w:szCs w:val="24"/>
-        </w:rPr>
-        <w:t>vite@latest</w:t>
-      </w:r>
-      <w:proofErr w:type="spellEnd"/>
-      <w:r>
-        <w:rPr>
-          <w:rFonts w:ascii="Times New Roman" w:hAnsi="Times New Roman" w:cs="Times New Roman"/>
-          <w:sz w:val="24"/>
-          <w:szCs w:val="24"/>
-        </w:rPr>
-        <w:t xml:space="preserve"> </w:t>
-      </w:r>
-      <w:proofErr w:type="spellStart"/>
-      <w:r>
-        <w:rPr>
-          <w:rFonts w:ascii="Times New Roman" w:hAnsi="Times New Roman" w:cs="Times New Roman"/>
-          <w:sz w:val="24"/>
-          <w:szCs w:val="24"/>
-        </w:rPr>
-        <w:t>ingrido</w:t>
-      </w:r>
-      <w:proofErr w:type="spellEnd"/>
-      <w:r>
-        <w:rPr>
-          <w:rFonts w:ascii="Times New Roman" w:hAnsi="Times New Roman" w:cs="Times New Roman"/>
-          <w:sz w:val="24"/>
-          <w:szCs w:val="24"/>
-        </w:rPr>
-        <w:t>-frontend (after running this command select these in terminal)</w:t>
+      <w:r>
+        <w:rPr>
+          <w:rFonts w:ascii="Times New Roman" w:hAnsi="Times New Roman" w:cs="Times New Roman"/>
+          <w:sz w:val="24"/>
+          <w:szCs w:val="24"/>
+        </w:rPr>
+        <w:t>Then in terminal paste the following command.</w:t>
       </w:r>
     </w:p>
     <w:p>
@@ -725,7 +683,7 @@
         <w:pStyle w:val="ListParagraph"/>
         <w:numPr>
           <w:ilvl w:val="0"/>
-          <w:numId w:val="3"/>
+          <w:numId w:val="10"/>
         </w:numPr>
         <w:rPr>
           <w:rFonts w:ascii="Times New Roman" w:hAnsi="Times New Roman" w:cs="Times New Roman"/>
@@ -733,102 +691,6 @@
           <w:szCs w:val="24"/>
         </w:rPr>
       </w:pPr>
-      <w:r>
-        <w:rPr>
-          <w:rFonts w:ascii="Times New Roman" w:hAnsi="Times New Roman" w:cs="Times New Roman"/>
-          <w:sz w:val="24"/>
-          <w:szCs w:val="24"/>
-        </w:rPr>
-        <w:t>Select React framework.</w:t>
-      </w:r>
-    </w:p>
-    <w:p>
-      <w:pPr>
-        <w:pStyle w:val="ListParagraph"/>
-        <w:numPr>
-          <w:ilvl w:val="0"/>
-          <w:numId w:val="3"/>
-        </w:numPr>
-        <w:rPr>
-          <w:rFonts w:ascii="Times New Roman" w:hAnsi="Times New Roman" w:cs="Times New Roman"/>
-          <w:sz w:val="24"/>
-          <w:szCs w:val="24"/>
-        </w:rPr>
-      </w:pPr>
-      <w:r>
-        <w:rPr>
-          <w:rFonts w:ascii="Times New Roman" w:hAnsi="Times New Roman" w:cs="Times New Roman"/>
-          <w:sz w:val="24"/>
-          <w:szCs w:val="24"/>
-        </w:rPr>
-        <w:t>JavaScript + React Compiler</w:t>
-      </w:r>
-    </w:p>
-    <w:p>
-      <w:pPr>
-        <w:pStyle w:val="ListParagraph"/>
-        <w:numPr>
-          <w:ilvl w:val="0"/>
-          <w:numId w:val="3"/>
-        </w:numPr>
-        <w:rPr>
-          <w:rFonts w:ascii="Times New Roman" w:hAnsi="Times New Roman" w:cs="Times New Roman"/>
-          <w:sz w:val="24"/>
-          <w:szCs w:val="24"/>
-        </w:rPr>
-      </w:pPr>
-      <w:r>
-        <w:rPr>
-          <w:rFonts w:ascii="Times New Roman" w:hAnsi="Times New Roman" w:cs="Times New Roman"/>
-          <w:sz w:val="24"/>
-          <w:szCs w:val="24"/>
-        </w:rPr>
-        <w:t>NO</w:t>
-      </w:r>
-    </w:p>
-    <w:p>
-      <w:pPr>
-        <w:pStyle w:val="ListParagraph"/>
-        <w:numPr>
-          <w:ilvl w:val="0"/>
-          <w:numId w:val="3"/>
-        </w:numPr>
-        <w:rPr>
-          <w:rFonts w:ascii="Times New Roman" w:hAnsi="Times New Roman" w:cs="Times New Roman"/>
-          <w:sz w:val="24"/>
-          <w:szCs w:val="24"/>
-        </w:rPr>
-      </w:pPr>
-      <w:r>
-        <w:rPr>
-          <w:rFonts w:ascii="Times New Roman" w:hAnsi="Times New Roman" w:cs="Times New Roman"/>
-          <w:sz w:val="24"/>
-          <w:szCs w:val="24"/>
-        </w:rPr>
-        <w:t>Yes</w:t>
-      </w:r>
-    </w:p>
-    <w:p>
-      <w:pPr>
-        <w:pStyle w:val="ListParagraph"/>
-        <w:numPr>
-          <w:ilvl w:val="0"/>
-          <w:numId w:val="2"/>
-        </w:numPr>
-        <w:rPr>
-          <w:rFonts w:ascii="Times New Roman" w:hAnsi="Times New Roman" w:cs="Times New Roman"/>
-          <w:sz w:val="24"/>
-          <w:szCs w:val="24"/>
-        </w:rPr>
-      </w:pPr>
-      <w:r>
-        <w:rPr>
-          <w:rFonts w:ascii="Times New Roman" w:hAnsi="Times New Roman" w:cs="Times New Roman"/>
-          <w:sz w:val="24"/>
-          <w:szCs w:val="24"/>
-        </w:rPr>
-        <w:t xml:space="preserve">cd </w:t>
-      </w:r>
       <w:proofErr w:type="spellStart"/>
       <w:r>
         <w:rPr>
@@ -836,7 +698,7 @@
           <w:sz w:val="24"/>
           <w:szCs w:val="24"/>
         </w:rPr>
-        <w:t>ingrido</w:t>
+        <w:t>npm</w:t>
       </w:r>
       <w:proofErr w:type="spellEnd"/>
       <w:r>
@@ -845,151 +707,7 @@
           <w:sz w:val="24"/>
           <w:szCs w:val="24"/>
         </w:rPr>
-        <w:t>-frontend</w:t>
-      </w:r>
-    </w:p>
-    <w:p>
-      <w:pPr>
-        <w:pStyle w:val="ListParagraph"/>
-        <w:numPr>
-          <w:ilvl w:val="0"/>
-          <w:numId w:val="2"/>
-        </w:numPr>
-        <w:rPr>
-          <w:rFonts w:ascii="Times New Roman" w:hAnsi="Times New Roman" w:cs="Times New Roman"/>
-          <w:sz w:val="24"/>
-          <w:szCs w:val="24"/>
-        </w:rPr>
-      </w:pPr>
-      <w:proofErr w:type="spellStart"/>
-      <w:r>
-        <w:rPr>
-          <w:rFonts w:ascii="Times New Roman" w:hAnsi="Times New Roman" w:cs="Times New Roman"/>
-          <w:sz w:val="24"/>
-          <w:szCs w:val="24"/>
-        </w:rPr>
-        <w:t>npm</w:t>
-      </w:r>
-      <w:proofErr w:type="spellEnd"/>
-      <w:r>
-        <w:rPr>
-          <w:rFonts w:ascii="Times New Roman" w:hAnsi="Times New Roman" w:cs="Times New Roman"/>
-          <w:sz w:val="24"/>
-          <w:szCs w:val="24"/>
-        </w:rPr>
-        <w:t xml:space="preserve"> install </w:t>
-      </w:r>
-      <w:proofErr w:type="spellStart"/>
-      <w:r>
-        <w:rPr>
-          <w:rFonts w:ascii="Times New Roman" w:hAnsi="Times New Roman" w:cs="Times New Roman"/>
-          <w:sz w:val="24"/>
-          <w:szCs w:val="24"/>
-        </w:rPr>
-        <w:t>tailwindcss</w:t>
-      </w:r>
-      <w:proofErr w:type="spellEnd"/>
-      <w:r>
-        <w:rPr>
-          <w:rFonts w:ascii="Times New Roman" w:hAnsi="Times New Roman" w:cs="Times New Roman"/>
-          <w:sz w:val="24"/>
-          <w:szCs w:val="24"/>
-        </w:rPr>
-        <w:t xml:space="preserve"> @tailwindcss/postcss </w:t>
-      </w:r>
-      <w:proofErr w:type="spellStart"/>
-      <w:r>
-        <w:rPr>
-          <w:rFonts w:ascii="Times New Roman" w:hAnsi="Times New Roman" w:cs="Times New Roman"/>
-          <w:sz w:val="24"/>
-          <w:szCs w:val="24"/>
-        </w:rPr>
-        <w:t>postcss</w:t>
-      </w:r>
-      <w:proofErr w:type="spellEnd"/>
-    </w:p>
-    <w:p>
-      <w:pPr>
-        <w:pStyle w:val="ListParagraph"/>
-        <w:numPr>
-          <w:ilvl w:val="0"/>
-          <w:numId w:val="2"/>
-        </w:numPr>
-        <w:rPr>
-          <w:rFonts w:ascii="Times New Roman" w:hAnsi="Times New Roman" w:cs="Times New Roman"/>
-          <w:sz w:val="24"/>
-          <w:szCs w:val="24"/>
-        </w:rPr>
-      </w:pPr>
-      <w:proofErr w:type="spellStart"/>
-      <w:r>
-        <w:rPr>
-          <w:rFonts w:ascii="Times New Roman" w:hAnsi="Times New Roman" w:cs="Times New Roman"/>
-          <w:sz w:val="24"/>
-          <w:szCs w:val="24"/>
-        </w:rPr>
-        <w:t>npm</w:t>
-      </w:r>
-      <w:proofErr w:type="spellEnd"/>
-      <w:r>
-        <w:rPr>
-          <w:rFonts w:ascii="Times New Roman" w:hAnsi="Times New Roman" w:cs="Times New Roman"/>
-          <w:sz w:val="24"/>
-          <w:szCs w:val="24"/>
-        </w:rPr>
-        <w:t xml:space="preserve"> list </w:t>
-      </w:r>
-      <w:proofErr w:type="spellStart"/>
-      <w:r>
-        <w:rPr>
-          <w:rFonts w:ascii="Times New Roman" w:hAnsi="Times New Roman" w:cs="Times New Roman"/>
-          <w:sz w:val="24"/>
-          <w:szCs w:val="24"/>
-        </w:rPr>
-        <w:t>tailwindcss</w:t>
-      </w:r>
-      <w:proofErr w:type="spellEnd"/>
-      <w:r>
-        <w:rPr>
-          <w:rFonts w:ascii="Times New Roman" w:hAnsi="Times New Roman" w:cs="Times New Roman"/>
-          <w:sz w:val="24"/>
-          <w:szCs w:val="24"/>
-        </w:rPr>
-        <w:t xml:space="preserve"> </w:t>
-      </w:r>
-      <w:r>
-        <w:rPr>
-          <w:rFonts w:ascii="Times New Roman" w:hAnsi="Times New Roman" w:cs="Times New Roman"/>
-          <w:sz w:val="24"/>
-          <w:szCs w:val="24"/>
-        </w:rPr>
-        <w:t>(ensure there is tailwind</w:t>
-      </w:r>
-      <w:r>
-        <w:rPr>
-          <w:rFonts w:ascii="Times New Roman" w:hAnsi="Times New Roman" w:cs="Times New Roman"/>
-          <w:sz w:val="24"/>
-          <w:szCs w:val="24"/>
-        </w:rPr>
-        <w:t>/</w:t>
-      </w:r>
-      <w:proofErr w:type="spellStart"/>
-      <w:r>
-        <w:rPr>
-          <w:rFonts w:ascii="Times New Roman" w:hAnsi="Times New Roman" w:cs="Times New Roman"/>
-          <w:sz w:val="24"/>
-          <w:szCs w:val="24"/>
-        </w:rPr>
-        <w:t>postcss</w:t>
-      </w:r>
-      <w:proofErr w:type="spellEnd"/>
-      <w:r>
-        <w:rPr>
-          <w:rFonts w:ascii="Times New Roman" w:hAnsi="Times New Roman" w:cs="Times New Roman"/>
-          <w:sz w:val="24"/>
-          <w:szCs w:val="24"/>
-        </w:rPr>
-        <w:t xml:space="preserve"> 4.x.x version exits)</w:t>
+        <w:t xml:space="preserve"> install</w:t>
       </w:r>
     </w:p>
     <w:p>
@@ -1404,6 +1122,119 @@
     </w:lvl>
   </w:abstractNum>
   <w:abstractNum w:abstractNumId="3" w15:restartNumberingAfterBreak="0">
+    <w:nsid w:val="3A1E44A3"/>
+    <w:multiLevelType w:val="hybridMultilevel"/>
+    <w:tmpl w:val="B63E0CA6"/>
+    <w:lvl w:ilvl="0" w:tplc="04090001">
+      <w:start w:val="1"/>
+      <w:numFmt w:val="bullet"/>
+      <w:lvlText w:val=""/>
+      <w:lvlJc w:val="left"/>
+      <w:pPr>
+        <w:ind w:left="720" w:hanging="360"/>
+      </w:pPr>
+      <w:rPr>
+        <w:rFonts w:ascii="Symbol" w:hAnsi="Symbol" w:hint="default"/>
+      </w:rPr>
+    </w:lvl>
+    <w:lvl w:ilvl="1" w:tplc="04090003" w:tentative="1">
+      <w:start w:val="1"/>
+      <w:numFmt w:val="bullet"/>
+      <w:lvlText w:val="o"/>
+      <w:lvlJc w:val="left"/>
+      <w:pPr>
+        <w:ind w:left="1440" w:hanging="360"/>
+      </w:pPr>
+      <w:rPr>
+        <w:rFonts w:ascii="Courier New" w:hAnsi="Courier New" w:cs="Courier New" w:hint="default"/>
+      </w:rPr>
+    </w:lvl>
+    <w:lvl w:ilvl="2" w:tplc="04090005" w:tentative="1">
+      <w:start w:val="1"/>
+      <w:numFmt w:val="bullet"/>
+      <w:lvlText w:val=""/>
+      <w:lvlJc w:val="left"/>
+      <w:pPr>
+        <w:ind w:left="2160" w:hanging="360"/>
+      </w:pPr>
+      <w:rPr>
+        <w:rFonts w:ascii="Wingdings" w:hAnsi="Wingdings" w:hint="default"/>
+      </w:rPr>
+    </w:lvl>
+    <w:lvl w:ilvl="3" w:tplc="04090001" w:tentative="1">
+      <w:start w:val="1"/>
+      <w:numFmt w:val="bullet"/>
+      <w:lvlText w:val=""/>
+      <w:lvlJc w:val="left"/>
+      <w:pPr>
+        <w:ind w:left="2880" w:hanging="360"/>
+      </w:pPr>
+      <w:rPr>
+        <w:rFonts w:ascii="Symbol" w:hAnsi="Symbol" w:hint="default"/>
+      </w:rPr>
+    </w:lvl>
+    <w:lvl w:ilvl="4" w:tplc="04090003" w:tentative="1">
+      <w:start w:val="1"/>
+      <w:numFmt w:val="bullet"/>
+      <w:lvlText w:val="o"/>
+      <w:lvlJc w:val="left"/>
+      <w:pPr>
+        <w:ind w:left="3600" w:hanging="360"/>
+      </w:pPr>
+      <w:rPr>
+        <w:rFonts w:ascii="Courier New" w:hAnsi="Courier New" w:cs="Courier New" w:hint="default"/>
+      </w:rPr>
+    </w:lvl>
+    <w:lvl w:ilvl="5" w:tplc="04090005" w:tentative="1">
+      <w:start w:val="1"/>
+      <w:numFmt w:val="bullet"/>
+      <w:lvlText w:val=""/>
+      <w:lvlJc w:val="left"/>
+      <w:pPr>
+        <w:ind w:left="4320" w:hanging="360"/>
+      </w:pPr>
+      <w:rPr>
+        <w:rFonts w:ascii="Wingdings" w:hAnsi="Wingdings" w:hint="default"/>
+      </w:rPr>
+    </w:lvl>
+    <w:lvl w:ilvl="6" w:tplc="04090001" w:tentative="1">
+      <w:start w:val="1"/>
+      <w:numFmt w:val="bullet"/>
+      <w:lvlText w:val=""/>
+      <w:lvlJc w:val="left"/>
+      <w:pPr>
+        <w:ind w:left="5040" w:hanging="360"/>
+      </w:pPr>
+      <w:rPr>
+        <w:rFonts w:ascii="Symbol" w:hAnsi="Symbol" w:hint="default"/>
+      </w:rPr>
+    </w:lvl>
+    <w:lvl w:ilvl="7" w:tplc="04090003" w:tentative="1">
+      <w:start w:val="1"/>
+      <w:numFmt w:val="bullet"/>
+      <w:lvlText w:val="o"/>
+      <w:lvlJc w:val="left"/>
+      <w:pPr>
+        <w:ind w:left="5760" w:hanging="360"/>
+      </w:pPr>
+      <w:rPr>
+        <w:rFonts w:ascii="Courier New" w:hAnsi="Courier New" w:cs="Courier New" w:hint="default"/>
+      </w:rPr>
+    </w:lvl>
+    <w:lvl w:ilvl="8" w:tplc="04090005" w:tentative="1">
+      <w:start w:val="1"/>
+      <w:numFmt w:val="bullet"/>
+      <w:lvlText w:val=""/>
+      <w:lvlJc w:val="left"/>
+      <w:pPr>
+        <w:ind w:left="6480" w:hanging="360"/>
+      </w:pPr>
+      <w:rPr>
+        <w:rFonts w:ascii="Wingdings" w:hAnsi="Wingdings" w:hint="default"/>
+      </w:rPr>
+    </w:lvl>
+  </w:abstractNum>
+  <w:abstractNum w:abstractNumId="4" w15:restartNumberingAfterBreak="0">
     <w:nsid w:val="3A5756AF"/>
     <w:multiLevelType w:val="hybridMultilevel"/>
     <w:tmpl w:val="5B6003FC"/>
@@ -1516,7 +1347,7 @@
       </w:rPr>
     </w:lvl>
   </w:abstractNum>
-  <w:abstractNum w:abstractNumId="4" w15:restartNumberingAfterBreak="0">
+  <w:abstractNum w:abstractNumId="5" w15:restartNumberingAfterBreak="0">
     <w:nsid w:val="43DD3373"/>
     <w:multiLevelType w:val="hybridMultilevel"/>
     <w:tmpl w:val="E8524624"/>
@@ -1629,7 +1460,7 @@
       </w:rPr>
     </w:lvl>
   </w:abstractNum>
-  <w:abstractNum w:abstractNumId="5" w15:restartNumberingAfterBreak="0">
+  <w:abstractNum w:abstractNumId="6" w15:restartNumberingAfterBreak="0">
     <w:nsid w:val="4C632AE1"/>
     <w:multiLevelType w:val="hybridMultilevel"/>
     <w:tmpl w:val="EB78E880"/>
@@ -1742,7 +1573,7 @@
       </w:rPr>
     </w:lvl>
   </w:abstractNum>
-  <w:abstractNum w:abstractNumId="6" w15:restartNumberingAfterBreak="0">
+  <w:abstractNum w:abstractNumId="7" w15:restartNumberingAfterBreak="0">
     <w:nsid w:val="569972FF"/>
     <w:multiLevelType w:val="hybridMultilevel"/>
     <w:tmpl w:val="C48488BC"/>
@@ -1855,7 +1686,7 @@
       </w:rPr>
     </w:lvl>
   </w:abstractNum>
-  <w:abstractNum w:abstractNumId="7" w15:restartNumberingAfterBreak="0">
+  <w:abstractNum w:abstractNumId="8" w15:restartNumberingAfterBreak="0">
     <w:nsid w:val="613D323F"/>
     <w:multiLevelType w:val="hybridMultilevel"/>
     <w:tmpl w:val="CE74CA74"/>
@@ -1968,7 +1799,7 @@
       </w:rPr>
     </w:lvl>
   </w:abstractNum>
-  <w:abstractNum w:abstractNumId="8" w15:restartNumberingAfterBreak="0">
+  <w:abstractNum w:abstractNumId="9" w15:restartNumberingAfterBreak="0">
     <w:nsid w:val="664B25F3"/>
     <w:multiLevelType w:val="hybridMultilevel"/>
     <w:tmpl w:val="333CE594"/>
@@ -2082,31 +1913,34 @@
     </w:lvl>
   </w:abstractNum>
   <w:num w:numId="1">
-    <w:abstractNumId w:val="5"/>
+    <w:abstractNumId w:val="6"/>
   </w:num>
   <w:num w:numId="2">
-    <w:abstractNumId w:val="7"/>
+    <w:abstractNumId w:val="8"/>
   </w:num>
   <w:num w:numId="3">
-    <w:abstractNumId w:val="8"/>
+    <w:abstractNumId w:val="9"/>
   </w:num>
   <w:num w:numId="4">
-    <w:abstractNumId w:val="4"/>
+    <w:abstractNumId w:val="5"/>
   </w:num>
   <w:num w:numId="5">
     <w:abstractNumId w:val="2"/>
   </w:num>
   <w:num w:numId="6">
-    <w:abstractNumId w:val="3"/>
+    <w:abstractNumId w:val="4"/>
   </w:num>
   <w:num w:numId="7">
     <w:abstractNumId w:val="0"/>
   </w:num>
   <w:num w:numId="8">
-    <w:abstractNumId w:val="6"/>
+    <w:abstractNumId w:val="7"/>
   </w:num>
   <w:num w:numId="9">
     <w:abstractNumId w:val="1"/>
+  </w:num>
+  <w:num w:numId="10">
+    <w:abstractNumId w:val="3"/>
   </w:num>
 </w:numbering>
 </file>

</xml_diff>